<commit_message>
cambios para nuevo catalogo
</commit_message>
<xml_diff>
--- a/public/assets/documents/template-word/templateCorrespondencia.docx
+++ b/public/assets/documents/template-word/templateCorrespondencia.docx
@@ -1,6 +1,6 @@
 
 <file path=word/document.xml><?xml version="1.0" encoding="utf-8"?>
-<w:document xmlns:wpc="http://schemas.microsoft.com/office/word/2010/wordprocessingCanvas" xmlns:cx="http://schemas.microsoft.com/office/drawing/2014/chartex" xmlns:cx1="http://schemas.microsoft.com/office/drawing/2015/9/8/chartex" xmlns:cx2="http://schemas.microsoft.com/office/drawing/2015/10/21/chartex" xmlns:cx3="http://schemas.microsoft.com/office/drawing/2016/5/9/chartex" xmlns:cx4="http://schemas.microsoft.com/office/drawing/2016/5/10/chartex" xmlns:cx5="http://schemas.microsoft.com/office/drawing/2016/5/11/chartex" xmlns:cx6="http://schemas.microsoft.com/office/drawing/2016/5/12/chartex" xmlns:cx7="http://schemas.microsoft.com/office/drawing/2016/5/13/chartex" xmlns:cx8="http://schemas.microsoft.com/office/drawing/2016/5/14/chartex" xmlns:mc="http://schemas.openxmlformats.org/markup-compatibility/2006" xmlns:aink="http://schemas.microsoft.com/office/drawing/2016/ink" xmlns:am3d="http://schemas.microsoft.com/office/drawing/2017/model3d" xmlns:o="urn:schemas-microsoft-com:office:office" xmlns:oel="http://schemas.microsoft.com/office/2019/extlst" xmlns:r="http://schemas.openxmlformats.org/officeDocument/2006/relationships" xmlns:m="http://schemas.openxmlformats.org/officeDocument/2006/math" xmlns:v="urn:schemas-microsoft-com:vml" xmlns:wp14="http://schemas.microsoft.com/office/word/2010/wordprocessingDrawing" xmlns:wp="http://schemas.openxmlformats.org/drawingml/2006/wordprocessingDrawing" xmlns:w10="urn:schemas-microsoft-com:office:word" xmlns:w="http://schemas.openxmlformats.org/wordprocessingml/2006/main" xmlns:w14="http://schemas.microsoft.com/office/word/2010/wordml" xmlns:w15="http://schemas.microsoft.com/office/word/2012/wordml" xmlns:w16cex="http://schemas.microsoft.com/office/word/2018/wordml/cex" xmlns:w16cid="http://schemas.microsoft.com/office/word/2016/wordml/cid" xmlns:w16="http://schemas.microsoft.com/office/word/2018/wordml" xmlns:w16du="http://schemas.microsoft.com/office/word/2023/wordml/word16du" xmlns:w16sdtdh="http://schemas.microsoft.com/office/word/2020/wordml/sdtdatahash" xmlns:w16se="http://schemas.microsoft.com/office/word/2015/wordml/symex" xmlns:wpg="http://schemas.microsoft.com/office/word/2010/wordprocessingGroup" xmlns:wpi="http://schemas.microsoft.com/office/word/2010/wordprocessingInk" xmlns:wne="http://schemas.microsoft.com/office/word/2006/wordml" xmlns:wps="http://schemas.microsoft.com/office/word/2010/wordprocessingShape" mc:Ignorable="w14 w15 w16se w16cid w16 w16cex w16sdtdh w16du wp14">
+<w:document xmlns:wpc="http://schemas.microsoft.com/office/word/2010/wordprocessingCanvas" xmlns:cx="http://schemas.microsoft.com/office/drawing/2014/chartex" xmlns:cx1="http://schemas.microsoft.com/office/drawing/2015/9/8/chartex" xmlns:cx2="http://schemas.microsoft.com/office/drawing/2015/10/21/chartex" xmlns:cx3="http://schemas.microsoft.com/office/drawing/2016/5/9/chartex" xmlns:cx4="http://schemas.microsoft.com/office/drawing/2016/5/10/chartex" xmlns:cx5="http://schemas.microsoft.com/office/drawing/2016/5/11/chartex" xmlns:cx6="http://schemas.microsoft.com/office/drawing/2016/5/12/chartex" xmlns:cx7="http://schemas.microsoft.com/office/drawing/2016/5/13/chartex" xmlns:cx8="http://schemas.microsoft.com/office/drawing/2016/5/14/chartex" xmlns:mc="http://schemas.openxmlformats.org/markup-compatibility/2006" xmlns:aink="http://schemas.microsoft.com/office/drawing/2016/ink" xmlns:am3d="http://schemas.microsoft.com/office/drawing/2017/model3d" xmlns:o="urn:schemas-microsoft-com:office:office" xmlns:oel="http://schemas.microsoft.com/office/2019/extlst" xmlns:r="http://schemas.openxmlformats.org/officeDocument/2006/relationships" xmlns:m="http://schemas.openxmlformats.org/officeDocument/2006/math" xmlns:v="urn:schemas-microsoft-com:vml" xmlns:wp14="http://schemas.microsoft.com/office/word/2010/wordprocessingDrawing" xmlns:wp="http://schemas.openxmlformats.org/drawingml/2006/wordprocessingDrawing" xmlns:w10="urn:schemas-microsoft-com:office:word" xmlns:w="http://schemas.openxmlformats.org/wordprocessingml/2006/main" xmlns:w14="http://schemas.microsoft.com/office/word/2010/wordml" xmlns:w15="http://schemas.microsoft.com/office/word/2012/wordml" xmlns:w16cex="http://schemas.microsoft.com/office/word/2018/wordml/cex" xmlns:w16cid="http://schemas.microsoft.com/office/word/2016/wordml/cid" xmlns:w16="http://schemas.microsoft.com/office/word/2018/wordml" xmlns:w16du="http://schemas.microsoft.com/office/word/2023/wordml/word16du" xmlns:w16sdtdh="http://schemas.microsoft.com/office/word/2020/wordml/sdtdatahash" xmlns:w16sdtfl="http://schemas.microsoft.com/office/word/2024/wordml/sdtformatlock" xmlns:w16se="http://schemas.microsoft.com/office/word/2015/wordml/symex" xmlns:wpg="http://schemas.microsoft.com/office/word/2010/wordprocessingGroup" xmlns:wpi="http://schemas.microsoft.com/office/word/2010/wordprocessingInk" xmlns:wne="http://schemas.microsoft.com/office/word/2006/wordml" xmlns:wps="http://schemas.microsoft.com/office/word/2010/wordprocessingShape" mc:Ignorable="w14 w15 w16se w16cid w16 w16cex w16sdtdh w16sdtfl w16du wp14">
   <w:body>
     <w:p>
       <w:pPr>
@@ -611,18 +611,7 @@
                                 <w:sz w:val="28"/>
                                 <w:szCs w:val="28"/>
                               </w:rPr>
-                              <w:t>Informe</w:t>
-                            </w:r>
-                            <w:r>
-                              <w:rPr>
-                                <w:rFonts w:ascii="Geomanist" w:hAnsi="Geomanist"/>
-                                <w:b/>
-                                <w:bCs/>
-                                <w:color w:val="10312B"/>
-                                <w:sz w:val="28"/>
-                                <w:szCs w:val="28"/>
-                              </w:rPr>
-                              <w:t xml:space="preserve"> correspondencia</w:t>
+                              <w:t>Gestión de control</w:t>
                             </w:r>
                           </w:p>
                           <w:p/>
@@ -669,18 +658,7 @@
                           <w:sz w:val="28"/>
                           <w:szCs w:val="28"/>
                         </w:rPr>
-                        <w:t>Informe</w:t>
-                      </w:r>
-                      <w:r>
-                        <w:rPr>
-                          <w:rFonts w:ascii="Geomanist" w:hAnsi="Geomanist"/>
-                          <w:b/>
-                          <w:bCs/>
-                          <w:color w:val="10312B"/>
-                          <w:sz w:val="28"/>
-                          <w:szCs w:val="28"/>
-                        </w:rPr>
-                        <w:t xml:space="preserve"> correspondencia</w:t>
+                        <w:t>Gestión de control</w:t>
                       </w:r>
                     </w:p>
                     <w:p/>
@@ -1054,46 +1032,6 @@
                 <w:szCs w:val="22"/>
               </w:rPr>
               <w:t>Código</w:t>
-            </w:r>
-          </w:p>
-        </w:tc>
-        <w:tc>
-          <w:tcPr>
-            <w:tcW w:w="9214" w:type="dxa"/>
-          </w:tcPr>
-          <w:p>
-            <w:pPr>
-              <w:jc w:val="both"/>
-              <w:rPr>
-                <w:sz w:val="22"/>
-                <w:szCs w:val="22"/>
-              </w:rPr>
-            </w:pPr>
-          </w:p>
-        </w:tc>
-      </w:tr>
-      <w:tr>
-        <w:trPr>
-          <w:trHeight w:val="840"/>
-        </w:trPr>
-        <w:tc>
-          <w:tcPr>
-            <w:tcW w:w="1696" w:type="dxa"/>
-          </w:tcPr>
-          <w:p>
-            <w:pPr>
-              <w:jc w:val="both"/>
-              <w:rPr>
-                <w:sz w:val="22"/>
-                <w:szCs w:val="22"/>
-              </w:rPr>
-            </w:pPr>
-            <w:r>
-              <w:rPr>
-                <w:sz w:val="22"/>
-                <w:szCs w:val="22"/>
-              </w:rPr>
-              <w:t>Descripción</w:t>
             </w:r>
           </w:p>
         </w:tc>
@@ -1809,7 +1747,7 @@
 </file>
 
 <file path=word/endnotes.xml><?xml version="1.0" encoding="utf-8"?>
-<w:endnotes xmlns:wpc="http://schemas.microsoft.com/office/word/2010/wordprocessingCanvas" xmlns:cx="http://schemas.microsoft.com/office/drawing/2014/chartex" xmlns:cx1="http://schemas.microsoft.com/office/drawing/2015/9/8/chartex" xmlns:cx2="http://schemas.microsoft.com/office/drawing/2015/10/21/chartex" xmlns:cx3="http://schemas.microsoft.com/office/drawing/2016/5/9/chartex" xmlns:cx4="http://schemas.microsoft.com/office/drawing/2016/5/10/chartex" xmlns:cx5="http://schemas.microsoft.com/office/drawing/2016/5/11/chartex" xmlns:cx6="http://schemas.microsoft.com/office/drawing/2016/5/12/chartex" xmlns:cx7="http://schemas.microsoft.com/office/drawing/2016/5/13/chartex" xmlns:cx8="http://schemas.microsoft.com/office/drawing/2016/5/14/chartex" xmlns:mc="http://schemas.openxmlformats.org/markup-compatibility/2006" xmlns:aink="http://schemas.microsoft.com/office/drawing/2016/ink" xmlns:am3d="http://schemas.microsoft.com/office/drawing/2017/model3d" xmlns:o="urn:schemas-microsoft-com:office:office" xmlns:oel="http://schemas.microsoft.com/office/2019/extlst" xmlns:r="http://schemas.openxmlformats.org/officeDocument/2006/relationships" xmlns:m="http://schemas.openxmlformats.org/officeDocument/2006/math" xmlns:v="urn:schemas-microsoft-com:vml" xmlns:wp14="http://schemas.microsoft.com/office/word/2010/wordprocessingDrawing" xmlns:wp="http://schemas.openxmlformats.org/drawingml/2006/wordprocessingDrawing" xmlns:w10="urn:schemas-microsoft-com:office:word" xmlns:w="http://schemas.openxmlformats.org/wordprocessingml/2006/main" xmlns:w14="http://schemas.microsoft.com/office/word/2010/wordml" xmlns:w15="http://schemas.microsoft.com/office/word/2012/wordml" xmlns:w16cex="http://schemas.microsoft.com/office/word/2018/wordml/cex" xmlns:w16cid="http://schemas.microsoft.com/office/word/2016/wordml/cid" xmlns:w16="http://schemas.microsoft.com/office/word/2018/wordml" xmlns:w16du="http://schemas.microsoft.com/office/word/2023/wordml/word16du" xmlns:w16sdtdh="http://schemas.microsoft.com/office/word/2020/wordml/sdtdatahash" xmlns:w16se="http://schemas.microsoft.com/office/word/2015/wordml/symex" xmlns:wpg="http://schemas.microsoft.com/office/word/2010/wordprocessingGroup" xmlns:wpi="http://schemas.microsoft.com/office/word/2010/wordprocessingInk" xmlns:wne="http://schemas.microsoft.com/office/word/2006/wordml" xmlns:wps="http://schemas.microsoft.com/office/word/2010/wordprocessingShape" mc:Ignorable="w14 w15 w16se w16cid w16 w16cex w16sdtdh w16du wp14">
+<w:endnotes xmlns:wpc="http://schemas.microsoft.com/office/word/2010/wordprocessingCanvas" xmlns:cx="http://schemas.microsoft.com/office/drawing/2014/chartex" xmlns:cx1="http://schemas.microsoft.com/office/drawing/2015/9/8/chartex" xmlns:cx2="http://schemas.microsoft.com/office/drawing/2015/10/21/chartex" xmlns:cx3="http://schemas.microsoft.com/office/drawing/2016/5/9/chartex" xmlns:cx4="http://schemas.microsoft.com/office/drawing/2016/5/10/chartex" xmlns:cx5="http://schemas.microsoft.com/office/drawing/2016/5/11/chartex" xmlns:cx6="http://schemas.microsoft.com/office/drawing/2016/5/12/chartex" xmlns:cx7="http://schemas.microsoft.com/office/drawing/2016/5/13/chartex" xmlns:cx8="http://schemas.microsoft.com/office/drawing/2016/5/14/chartex" xmlns:mc="http://schemas.openxmlformats.org/markup-compatibility/2006" xmlns:aink="http://schemas.microsoft.com/office/drawing/2016/ink" xmlns:am3d="http://schemas.microsoft.com/office/drawing/2017/model3d" xmlns:o="urn:schemas-microsoft-com:office:office" xmlns:oel="http://schemas.microsoft.com/office/2019/extlst" xmlns:r="http://schemas.openxmlformats.org/officeDocument/2006/relationships" xmlns:m="http://schemas.openxmlformats.org/officeDocument/2006/math" xmlns:v="urn:schemas-microsoft-com:vml" xmlns:wp14="http://schemas.microsoft.com/office/word/2010/wordprocessingDrawing" xmlns:wp="http://schemas.openxmlformats.org/drawingml/2006/wordprocessingDrawing" xmlns:w10="urn:schemas-microsoft-com:office:word" xmlns:w="http://schemas.openxmlformats.org/wordprocessingml/2006/main" xmlns:w14="http://schemas.microsoft.com/office/word/2010/wordml" xmlns:w15="http://schemas.microsoft.com/office/word/2012/wordml" xmlns:w16cex="http://schemas.microsoft.com/office/word/2018/wordml/cex" xmlns:w16cid="http://schemas.microsoft.com/office/word/2016/wordml/cid" xmlns:w16="http://schemas.microsoft.com/office/word/2018/wordml" xmlns:w16du="http://schemas.microsoft.com/office/word/2023/wordml/word16du" xmlns:w16sdtdh="http://schemas.microsoft.com/office/word/2020/wordml/sdtdatahash" xmlns:w16sdtfl="http://schemas.microsoft.com/office/word/2024/wordml/sdtformatlock" xmlns:w16se="http://schemas.microsoft.com/office/word/2015/wordml/symex" xmlns:wpg="http://schemas.microsoft.com/office/word/2010/wordprocessingGroup" xmlns:wpi="http://schemas.microsoft.com/office/word/2010/wordprocessingInk" xmlns:wne="http://schemas.microsoft.com/office/word/2006/wordml" xmlns:wps="http://schemas.microsoft.com/office/word/2010/wordprocessingShape" mc:Ignorable="w14 w15 w16se w16cid w16 w16cex w16sdtdh w16sdtfl w16du wp14">
   <w:endnote w:type="separator" w:id="-1">
     <w:p>
       <w:r>
@@ -1828,7 +1766,7 @@
 </file>
 
 <file path=word/footer1.xml><?xml version="1.0" encoding="utf-8"?>
-<w:ftr xmlns:wpc="http://schemas.microsoft.com/office/word/2010/wordprocessingCanvas" xmlns:cx="http://schemas.microsoft.com/office/drawing/2014/chartex" xmlns:cx1="http://schemas.microsoft.com/office/drawing/2015/9/8/chartex" xmlns:cx2="http://schemas.microsoft.com/office/drawing/2015/10/21/chartex" xmlns:cx3="http://schemas.microsoft.com/office/drawing/2016/5/9/chartex" xmlns:cx4="http://schemas.microsoft.com/office/drawing/2016/5/10/chartex" xmlns:cx5="http://schemas.microsoft.com/office/drawing/2016/5/11/chartex" xmlns:cx6="http://schemas.microsoft.com/office/drawing/2016/5/12/chartex" xmlns:cx7="http://schemas.microsoft.com/office/drawing/2016/5/13/chartex" xmlns:cx8="http://schemas.microsoft.com/office/drawing/2016/5/14/chartex" xmlns:mc="http://schemas.openxmlformats.org/markup-compatibility/2006" xmlns:aink="http://schemas.microsoft.com/office/drawing/2016/ink" xmlns:am3d="http://schemas.microsoft.com/office/drawing/2017/model3d" xmlns:o="urn:schemas-microsoft-com:office:office" xmlns:oel="http://schemas.microsoft.com/office/2019/extlst" xmlns:r="http://schemas.openxmlformats.org/officeDocument/2006/relationships" xmlns:m="http://schemas.openxmlformats.org/officeDocument/2006/math" xmlns:v="urn:schemas-microsoft-com:vml" xmlns:wp14="http://schemas.microsoft.com/office/word/2010/wordprocessingDrawing" xmlns:wp="http://schemas.openxmlformats.org/drawingml/2006/wordprocessingDrawing" xmlns:w10="urn:schemas-microsoft-com:office:word" xmlns:w="http://schemas.openxmlformats.org/wordprocessingml/2006/main" xmlns:w14="http://schemas.microsoft.com/office/word/2010/wordml" xmlns:w15="http://schemas.microsoft.com/office/word/2012/wordml" xmlns:w16cex="http://schemas.microsoft.com/office/word/2018/wordml/cex" xmlns:w16cid="http://schemas.microsoft.com/office/word/2016/wordml/cid" xmlns:w16="http://schemas.microsoft.com/office/word/2018/wordml" xmlns:w16du="http://schemas.microsoft.com/office/word/2023/wordml/word16du" xmlns:w16sdtdh="http://schemas.microsoft.com/office/word/2020/wordml/sdtdatahash" xmlns:w16se="http://schemas.microsoft.com/office/word/2015/wordml/symex" xmlns:wpg="http://schemas.microsoft.com/office/word/2010/wordprocessingGroup" xmlns:wpi="http://schemas.microsoft.com/office/word/2010/wordprocessingInk" xmlns:wne="http://schemas.microsoft.com/office/word/2006/wordml" xmlns:wps="http://schemas.microsoft.com/office/word/2010/wordprocessingShape" mc:Ignorable="w14 w15 w16se w16cid w16 w16cex w16sdtdh w16du wp14">
+<w:ftr xmlns:wpc="http://schemas.microsoft.com/office/word/2010/wordprocessingCanvas" xmlns:cx="http://schemas.microsoft.com/office/drawing/2014/chartex" xmlns:cx1="http://schemas.microsoft.com/office/drawing/2015/9/8/chartex" xmlns:cx2="http://schemas.microsoft.com/office/drawing/2015/10/21/chartex" xmlns:cx3="http://schemas.microsoft.com/office/drawing/2016/5/9/chartex" xmlns:cx4="http://schemas.microsoft.com/office/drawing/2016/5/10/chartex" xmlns:cx5="http://schemas.microsoft.com/office/drawing/2016/5/11/chartex" xmlns:cx6="http://schemas.microsoft.com/office/drawing/2016/5/12/chartex" xmlns:cx7="http://schemas.microsoft.com/office/drawing/2016/5/13/chartex" xmlns:cx8="http://schemas.microsoft.com/office/drawing/2016/5/14/chartex" xmlns:mc="http://schemas.openxmlformats.org/markup-compatibility/2006" xmlns:aink="http://schemas.microsoft.com/office/drawing/2016/ink" xmlns:am3d="http://schemas.microsoft.com/office/drawing/2017/model3d" xmlns:o="urn:schemas-microsoft-com:office:office" xmlns:oel="http://schemas.microsoft.com/office/2019/extlst" xmlns:r="http://schemas.openxmlformats.org/officeDocument/2006/relationships" xmlns:m="http://schemas.openxmlformats.org/officeDocument/2006/math" xmlns:v="urn:schemas-microsoft-com:vml" xmlns:wp14="http://schemas.microsoft.com/office/word/2010/wordprocessingDrawing" xmlns:wp="http://schemas.openxmlformats.org/drawingml/2006/wordprocessingDrawing" xmlns:w10="urn:schemas-microsoft-com:office:word" xmlns:w="http://schemas.openxmlformats.org/wordprocessingml/2006/main" xmlns:w14="http://schemas.microsoft.com/office/word/2010/wordml" xmlns:w15="http://schemas.microsoft.com/office/word/2012/wordml" xmlns:w16cex="http://schemas.microsoft.com/office/word/2018/wordml/cex" xmlns:w16cid="http://schemas.microsoft.com/office/word/2016/wordml/cid" xmlns:w16="http://schemas.microsoft.com/office/word/2018/wordml" xmlns:w16du="http://schemas.microsoft.com/office/word/2023/wordml/word16du" xmlns:w16sdtdh="http://schemas.microsoft.com/office/word/2020/wordml/sdtdatahash" xmlns:w16sdtfl="http://schemas.microsoft.com/office/word/2024/wordml/sdtformatlock" xmlns:w16se="http://schemas.microsoft.com/office/word/2015/wordml/symex" xmlns:wpg="http://schemas.microsoft.com/office/word/2010/wordprocessingGroup" xmlns:wpi="http://schemas.microsoft.com/office/word/2010/wordprocessingInk" xmlns:wne="http://schemas.microsoft.com/office/word/2006/wordml" xmlns:wps="http://schemas.microsoft.com/office/word/2010/wordprocessingShape" mc:Ignorable="w14 w15 w16se w16cid w16 w16cex w16sdtdh w16sdtfl w16du wp14">
   <w:p>
     <w:pPr>
       <w:pStyle w:val="Piedepgina"/>
@@ -2285,7 +2223,7 @@
 </file>
 
 <file path=word/footer2.xml><?xml version="1.0" encoding="utf-8"?>
-<w:ftr xmlns:wpc="http://schemas.microsoft.com/office/word/2010/wordprocessingCanvas" xmlns:cx="http://schemas.microsoft.com/office/drawing/2014/chartex" xmlns:cx1="http://schemas.microsoft.com/office/drawing/2015/9/8/chartex" xmlns:cx2="http://schemas.microsoft.com/office/drawing/2015/10/21/chartex" xmlns:cx3="http://schemas.microsoft.com/office/drawing/2016/5/9/chartex" xmlns:cx4="http://schemas.microsoft.com/office/drawing/2016/5/10/chartex" xmlns:cx5="http://schemas.microsoft.com/office/drawing/2016/5/11/chartex" xmlns:cx6="http://schemas.microsoft.com/office/drawing/2016/5/12/chartex" xmlns:cx7="http://schemas.microsoft.com/office/drawing/2016/5/13/chartex" xmlns:cx8="http://schemas.microsoft.com/office/drawing/2016/5/14/chartex" xmlns:mc="http://schemas.openxmlformats.org/markup-compatibility/2006" xmlns:aink="http://schemas.microsoft.com/office/drawing/2016/ink" xmlns:am3d="http://schemas.microsoft.com/office/drawing/2017/model3d" xmlns:o="urn:schemas-microsoft-com:office:office" xmlns:oel="http://schemas.microsoft.com/office/2019/extlst" xmlns:r="http://schemas.openxmlformats.org/officeDocument/2006/relationships" xmlns:m="http://schemas.openxmlformats.org/officeDocument/2006/math" xmlns:v="urn:schemas-microsoft-com:vml" xmlns:wp14="http://schemas.microsoft.com/office/word/2010/wordprocessingDrawing" xmlns:wp="http://schemas.openxmlformats.org/drawingml/2006/wordprocessingDrawing" xmlns:w10="urn:schemas-microsoft-com:office:word" xmlns:w="http://schemas.openxmlformats.org/wordprocessingml/2006/main" xmlns:w14="http://schemas.microsoft.com/office/word/2010/wordml" xmlns:w15="http://schemas.microsoft.com/office/word/2012/wordml" xmlns:w16cex="http://schemas.microsoft.com/office/word/2018/wordml/cex" xmlns:w16cid="http://schemas.microsoft.com/office/word/2016/wordml/cid" xmlns:w16="http://schemas.microsoft.com/office/word/2018/wordml" xmlns:w16du="http://schemas.microsoft.com/office/word/2023/wordml/word16du" xmlns:w16sdtdh="http://schemas.microsoft.com/office/word/2020/wordml/sdtdatahash" xmlns:w16se="http://schemas.microsoft.com/office/word/2015/wordml/symex" xmlns:wpg="http://schemas.microsoft.com/office/word/2010/wordprocessingGroup" xmlns:wpi="http://schemas.microsoft.com/office/word/2010/wordprocessingInk" xmlns:wne="http://schemas.microsoft.com/office/word/2006/wordml" xmlns:wps="http://schemas.microsoft.com/office/word/2010/wordprocessingShape" mc:Ignorable="w14 w15 w16se w16cid w16 w16cex w16sdtdh w16du wp14">
+<w:ftr xmlns:wpc="http://schemas.microsoft.com/office/word/2010/wordprocessingCanvas" xmlns:cx="http://schemas.microsoft.com/office/drawing/2014/chartex" xmlns:cx1="http://schemas.microsoft.com/office/drawing/2015/9/8/chartex" xmlns:cx2="http://schemas.microsoft.com/office/drawing/2015/10/21/chartex" xmlns:cx3="http://schemas.microsoft.com/office/drawing/2016/5/9/chartex" xmlns:cx4="http://schemas.microsoft.com/office/drawing/2016/5/10/chartex" xmlns:cx5="http://schemas.microsoft.com/office/drawing/2016/5/11/chartex" xmlns:cx6="http://schemas.microsoft.com/office/drawing/2016/5/12/chartex" xmlns:cx7="http://schemas.microsoft.com/office/drawing/2016/5/13/chartex" xmlns:cx8="http://schemas.microsoft.com/office/drawing/2016/5/14/chartex" xmlns:mc="http://schemas.openxmlformats.org/markup-compatibility/2006" xmlns:aink="http://schemas.microsoft.com/office/drawing/2016/ink" xmlns:am3d="http://schemas.microsoft.com/office/drawing/2017/model3d" xmlns:o="urn:schemas-microsoft-com:office:office" xmlns:oel="http://schemas.microsoft.com/office/2019/extlst" xmlns:r="http://schemas.openxmlformats.org/officeDocument/2006/relationships" xmlns:m="http://schemas.openxmlformats.org/officeDocument/2006/math" xmlns:v="urn:schemas-microsoft-com:vml" xmlns:wp14="http://schemas.microsoft.com/office/word/2010/wordprocessingDrawing" xmlns:wp="http://schemas.openxmlformats.org/drawingml/2006/wordprocessingDrawing" xmlns:w10="urn:schemas-microsoft-com:office:word" xmlns:w="http://schemas.openxmlformats.org/wordprocessingml/2006/main" xmlns:w14="http://schemas.microsoft.com/office/word/2010/wordml" xmlns:w15="http://schemas.microsoft.com/office/word/2012/wordml" xmlns:w16cex="http://schemas.microsoft.com/office/word/2018/wordml/cex" xmlns:w16cid="http://schemas.microsoft.com/office/word/2016/wordml/cid" xmlns:w16="http://schemas.microsoft.com/office/word/2018/wordml" xmlns:w16du="http://schemas.microsoft.com/office/word/2023/wordml/word16du" xmlns:w16sdtdh="http://schemas.microsoft.com/office/word/2020/wordml/sdtdatahash" xmlns:w16sdtfl="http://schemas.microsoft.com/office/word/2024/wordml/sdtformatlock" xmlns:w16se="http://schemas.microsoft.com/office/word/2015/wordml/symex" xmlns:wpg="http://schemas.microsoft.com/office/word/2010/wordprocessingGroup" xmlns:wpi="http://schemas.microsoft.com/office/word/2010/wordprocessingInk" xmlns:wne="http://schemas.microsoft.com/office/word/2006/wordml" xmlns:wps="http://schemas.microsoft.com/office/word/2010/wordprocessingShape" mc:Ignorable="w14 w15 w16se w16cid w16 w16cex w16sdtdh w16sdtfl w16du wp14">
   <w:p>
     <w:pPr>
       <w:pStyle w:val="Piedepgina"/>
@@ -2734,7 +2672,7 @@
 </file>
 
 <file path=word/footer3.xml><?xml version="1.0" encoding="utf-8"?>
-<w:ftr xmlns:wpc="http://schemas.microsoft.com/office/word/2010/wordprocessingCanvas" xmlns:cx="http://schemas.microsoft.com/office/drawing/2014/chartex" xmlns:cx1="http://schemas.microsoft.com/office/drawing/2015/9/8/chartex" xmlns:cx2="http://schemas.microsoft.com/office/drawing/2015/10/21/chartex" xmlns:cx3="http://schemas.microsoft.com/office/drawing/2016/5/9/chartex" xmlns:cx4="http://schemas.microsoft.com/office/drawing/2016/5/10/chartex" xmlns:cx5="http://schemas.microsoft.com/office/drawing/2016/5/11/chartex" xmlns:cx6="http://schemas.microsoft.com/office/drawing/2016/5/12/chartex" xmlns:cx7="http://schemas.microsoft.com/office/drawing/2016/5/13/chartex" xmlns:cx8="http://schemas.microsoft.com/office/drawing/2016/5/14/chartex" xmlns:mc="http://schemas.openxmlformats.org/markup-compatibility/2006" xmlns:aink="http://schemas.microsoft.com/office/drawing/2016/ink" xmlns:am3d="http://schemas.microsoft.com/office/drawing/2017/model3d" xmlns:o="urn:schemas-microsoft-com:office:office" xmlns:oel="http://schemas.microsoft.com/office/2019/extlst" xmlns:r="http://schemas.openxmlformats.org/officeDocument/2006/relationships" xmlns:m="http://schemas.openxmlformats.org/officeDocument/2006/math" xmlns:v="urn:schemas-microsoft-com:vml" xmlns:wp14="http://schemas.microsoft.com/office/word/2010/wordprocessingDrawing" xmlns:wp="http://schemas.openxmlformats.org/drawingml/2006/wordprocessingDrawing" xmlns:w10="urn:schemas-microsoft-com:office:word" xmlns:w="http://schemas.openxmlformats.org/wordprocessingml/2006/main" xmlns:w14="http://schemas.microsoft.com/office/word/2010/wordml" xmlns:w15="http://schemas.microsoft.com/office/word/2012/wordml" xmlns:w16cex="http://schemas.microsoft.com/office/word/2018/wordml/cex" xmlns:w16cid="http://schemas.microsoft.com/office/word/2016/wordml/cid" xmlns:w16="http://schemas.microsoft.com/office/word/2018/wordml" xmlns:w16du="http://schemas.microsoft.com/office/word/2023/wordml/word16du" xmlns:w16sdtdh="http://schemas.microsoft.com/office/word/2020/wordml/sdtdatahash" xmlns:w16se="http://schemas.microsoft.com/office/word/2015/wordml/symex" xmlns:wpg="http://schemas.microsoft.com/office/word/2010/wordprocessingGroup" xmlns:wpi="http://schemas.microsoft.com/office/word/2010/wordprocessingInk" xmlns:wne="http://schemas.microsoft.com/office/word/2006/wordml" xmlns:wps="http://schemas.microsoft.com/office/word/2010/wordprocessingShape" mc:Ignorable="w14 w15 w16se w16cid w16 w16cex w16sdtdh w16du wp14">
+<w:ftr xmlns:wpc="http://schemas.microsoft.com/office/word/2010/wordprocessingCanvas" xmlns:cx="http://schemas.microsoft.com/office/drawing/2014/chartex" xmlns:cx1="http://schemas.microsoft.com/office/drawing/2015/9/8/chartex" xmlns:cx2="http://schemas.microsoft.com/office/drawing/2015/10/21/chartex" xmlns:cx3="http://schemas.microsoft.com/office/drawing/2016/5/9/chartex" xmlns:cx4="http://schemas.microsoft.com/office/drawing/2016/5/10/chartex" xmlns:cx5="http://schemas.microsoft.com/office/drawing/2016/5/11/chartex" xmlns:cx6="http://schemas.microsoft.com/office/drawing/2016/5/12/chartex" xmlns:cx7="http://schemas.microsoft.com/office/drawing/2016/5/13/chartex" xmlns:cx8="http://schemas.microsoft.com/office/drawing/2016/5/14/chartex" xmlns:mc="http://schemas.openxmlformats.org/markup-compatibility/2006" xmlns:aink="http://schemas.microsoft.com/office/drawing/2016/ink" xmlns:am3d="http://schemas.microsoft.com/office/drawing/2017/model3d" xmlns:o="urn:schemas-microsoft-com:office:office" xmlns:oel="http://schemas.microsoft.com/office/2019/extlst" xmlns:r="http://schemas.openxmlformats.org/officeDocument/2006/relationships" xmlns:m="http://schemas.openxmlformats.org/officeDocument/2006/math" xmlns:v="urn:schemas-microsoft-com:vml" xmlns:wp14="http://schemas.microsoft.com/office/word/2010/wordprocessingDrawing" xmlns:wp="http://schemas.openxmlformats.org/drawingml/2006/wordprocessingDrawing" xmlns:w10="urn:schemas-microsoft-com:office:word" xmlns:w="http://schemas.openxmlformats.org/wordprocessingml/2006/main" xmlns:w14="http://schemas.microsoft.com/office/word/2010/wordml" xmlns:w15="http://schemas.microsoft.com/office/word/2012/wordml" xmlns:w16cex="http://schemas.microsoft.com/office/word/2018/wordml/cex" xmlns:w16cid="http://schemas.microsoft.com/office/word/2016/wordml/cid" xmlns:w16="http://schemas.microsoft.com/office/word/2018/wordml" xmlns:w16du="http://schemas.microsoft.com/office/word/2023/wordml/word16du" xmlns:w16sdtdh="http://schemas.microsoft.com/office/word/2020/wordml/sdtdatahash" xmlns:w16sdtfl="http://schemas.microsoft.com/office/word/2024/wordml/sdtformatlock" xmlns:w16se="http://schemas.microsoft.com/office/word/2015/wordml/symex" xmlns:wpg="http://schemas.microsoft.com/office/word/2010/wordprocessingGroup" xmlns:wpi="http://schemas.microsoft.com/office/word/2010/wordprocessingInk" xmlns:wne="http://schemas.microsoft.com/office/word/2006/wordml" xmlns:wps="http://schemas.microsoft.com/office/word/2010/wordprocessingShape" mc:Ignorable="w14 w15 w16se w16cid w16 w16cex w16sdtdh w16sdtfl w16du wp14">
   <w:p>
     <w:pPr>
       <w:pStyle w:val="Piedepgina"/>
@@ -2744,7 +2682,7 @@
 </file>
 
 <file path=word/footnotes.xml><?xml version="1.0" encoding="utf-8"?>
-<w:footnotes xmlns:wpc="http://schemas.microsoft.com/office/word/2010/wordprocessingCanvas" xmlns:cx="http://schemas.microsoft.com/office/drawing/2014/chartex" xmlns:cx1="http://schemas.microsoft.com/office/drawing/2015/9/8/chartex" xmlns:cx2="http://schemas.microsoft.com/office/drawing/2015/10/21/chartex" xmlns:cx3="http://schemas.microsoft.com/office/drawing/2016/5/9/chartex" xmlns:cx4="http://schemas.microsoft.com/office/drawing/2016/5/10/chartex" xmlns:cx5="http://schemas.microsoft.com/office/drawing/2016/5/11/chartex" xmlns:cx6="http://schemas.microsoft.com/office/drawing/2016/5/12/chartex" xmlns:cx7="http://schemas.microsoft.com/office/drawing/2016/5/13/chartex" xmlns:cx8="http://schemas.microsoft.com/office/drawing/2016/5/14/chartex" xmlns:mc="http://schemas.openxmlformats.org/markup-compatibility/2006" xmlns:aink="http://schemas.microsoft.com/office/drawing/2016/ink" xmlns:am3d="http://schemas.microsoft.com/office/drawing/2017/model3d" xmlns:o="urn:schemas-microsoft-com:office:office" xmlns:oel="http://schemas.microsoft.com/office/2019/extlst" xmlns:r="http://schemas.openxmlformats.org/officeDocument/2006/relationships" xmlns:m="http://schemas.openxmlformats.org/officeDocument/2006/math" xmlns:v="urn:schemas-microsoft-com:vml" xmlns:wp14="http://schemas.microsoft.com/office/word/2010/wordprocessingDrawing" xmlns:wp="http://schemas.openxmlformats.org/drawingml/2006/wordprocessingDrawing" xmlns:w10="urn:schemas-microsoft-com:office:word" xmlns:w="http://schemas.openxmlformats.org/wordprocessingml/2006/main" xmlns:w14="http://schemas.microsoft.com/office/word/2010/wordml" xmlns:w15="http://schemas.microsoft.com/office/word/2012/wordml" xmlns:w16cex="http://schemas.microsoft.com/office/word/2018/wordml/cex" xmlns:w16cid="http://schemas.microsoft.com/office/word/2016/wordml/cid" xmlns:w16="http://schemas.microsoft.com/office/word/2018/wordml" xmlns:w16du="http://schemas.microsoft.com/office/word/2023/wordml/word16du" xmlns:w16sdtdh="http://schemas.microsoft.com/office/word/2020/wordml/sdtdatahash" xmlns:w16se="http://schemas.microsoft.com/office/word/2015/wordml/symex" xmlns:wpg="http://schemas.microsoft.com/office/word/2010/wordprocessingGroup" xmlns:wpi="http://schemas.microsoft.com/office/word/2010/wordprocessingInk" xmlns:wne="http://schemas.microsoft.com/office/word/2006/wordml" xmlns:wps="http://schemas.microsoft.com/office/word/2010/wordprocessingShape" mc:Ignorable="w14 w15 w16se w16cid w16 w16cex w16sdtdh w16du wp14">
+<w:footnotes xmlns:wpc="http://schemas.microsoft.com/office/word/2010/wordprocessingCanvas" xmlns:cx="http://schemas.microsoft.com/office/drawing/2014/chartex" xmlns:cx1="http://schemas.microsoft.com/office/drawing/2015/9/8/chartex" xmlns:cx2="http://schemas.microsoft.com/office/drawing/2015/10/21/chartex" xmlns:cx3="http://schemas.microsoft.com/office/drawing/2016/5/9/chartex" xmlns:cx4="http://schemas.microsoft.com/office/drawing/2016/5/10/chartex" xmlns:cx5="http://schemas.microsoft.com/office/drawing/2016/5/11/chartex" xmlns:cx6="http://schemas.microsoft.com/office/drawing/2016/5/12/chartex" xmlns:cx7="http://schemas.microsoft.com/office/drawing/2016/5/13/chartex" xmlns:cx8="http://schemas.microsoft.com/office/drawing/2016/5/14/chartex" xmlns:mc="http://schemas.openxmlformats.org/markup-compatibility/2006" xmlns:aink="http://schemas.microsoft.com/office/drawing/2016/ink" xmlns:am3d="http://schemas.microsoft.com/office/drawing/2017/model3d" xmlns:o="urn:schemas-microsoft-com:office:office" xmlns:oel="http://schemas.microsoft.com/office/2019/extlst" xmlns:r="http://schemas.openxmlformats.org/officeDocument/2006/relationships" xmlns:m="http://schemas.openxmlformats.org/officeDocument/2006/math" xmlns:v="urn:schemas-microsoft-com:vml" xmlns:wp14="http://schemas.microsoft.com/office/word/2010/wordprocessingDrawing" xmlns:wp="http://schemas.openxmlformats.org/drawingml/2006/wordprocessingDrawing" xmlns:w10="urn:schemas-microsoft-com:office:word" xmlns:w="http://schemas.openxmlformats.org/wordprocessingml/2006/main" xmlns:w14="http://schemas.microsoft.com/office/word/2010/wordml" xmlns:w15="http://schemas.microsoft.com/office/word/2012/wordml" xmlns:w16cex="http://schemas.microsoft.com/office/word/2018/wordml/cex" xmlns:w16cid="http://schemas.microsoft.com/office/word/2016/wordml/cid" xmlns:w16="http://schemas.microsoft.com/office/word/2018/wordml" xmlns:w16du="http://schemas.microsoft.com/office/word/2023/wordml/word16du" xmlns:w16sdtdh="http://schemas.microsoft.com/office/word/2020/wordml/sdtdatahash" xmlns:w16sdtfl="http://schemas.microsoft.com/office/word/2024/wordml/sdtformatlock" xmlns:w16se="http://schemas.microsoft.com/office/word/2015/wordml/symex" xmlns:wpg="http://schemas.microsoft.com/office/word/2010/wordprocessingGroup" xmlns:wpi="http://schemas.microsoft.com/office/word/2010/wordprocessingInk" xmlns:wne="http://schemas.microsoft.com/office/word/2006/wordml" xmlns:wps="http://schemas.microsoft.com/office/word/2010/wordprocessingShape" mc:Ignorable="w14 w15 w16se w16cid w16 w16cex w16sdtdh w16sdtfl w16du wp14">
   <w:footnote w:type="separator" w:id="-1">
     <w:p>
       <w:r>
@@ -2763,7 +2701,7 @@
 </file>
 
 <file path=word/header1.xml><?xml version="1.0" encoding="utf-8"?>
-<w:hdr xmlns:wpc="http://schemas.microsoft.com/office/word/2010/wordprocessingCanvas" xmlns:cx="http://schemas.microsoft.com/office/drawing/2014/chartex" xmlns:cx1="http://schemas.microsoft.com/office/drawing/2015/9/8/chartex" xmlns:cx2="http://schemas.microsoft.com/office/drawing/2015/10/21/chartex" xmlns:cx3="http://schemas.microsoft.com/office/drawing/2016/5/9/chartex" xmlns:cx4="http://schemas.microsoft.com/office/drawing/2016/5/10/chartex" xmlns:cx5="http://schemas.microsoft.com/office/drawing/2016/5/11/chartex" xmlns:cx6="http://schemas.microsoft.com/office/drawing/2016/5/12/chartex" xmlns:cx7="http://schemas.microsoft.com/office/drawing/2016/5/13/chartex" xmlns:cx8="http://schemas.microsoft.com/office/drawing/2016/5/14/chartex" xmlns:mc="http://schemas.openxmlformats.org/markup-compatibility/2006" xmlns:aink="http://schemas.microsoft.com/office/drawing/2016/ink" xmlns:am3d="http://schemas.microsoft.com/office/drawing/2017/model3d" xmlns:o="urn:schemas-microsoft-com:office:office" xmlns:oel="http://schemas.microsoft.com/office/2019/extlst" xmlns:r="http://schemas.openxmlformats.org/officeDocument/2006/relationships" xmlns:m="http://schemas.openxmlformats.org/officeDocument/2006/math" xmlns:v="urn:schemas-microsoft-com:vml" xmlns:wp14="http://schemas.microsoft.com/office/word/2010/wordprocessingDrawing" xmlns:wp="http://schemas.openxmlformats.org/drawingml/2006/wordprocessingDrawing" xmlns:w10="urn:schemas-microsoft-com:office:word" xmlns:w="http://schemas.openxmlformats.org/wordprocessingml/2006/main" xmlns:w14="http://schemas.microsoft.com/office/word/2010/wordml" xmlns:w15="http://schemas.microsoft.com/office/word/2012/wordml" xmlns:w16cex="http://schemas.microsoft.com/office/word/2018/wordml/cex" xmlns:w16cid="http://schemas.microsoft.com/office/word/2016/wordml/cid" xmlns:w16="http://schemas.microsoft.com/office/word/2018/wordml" xmlns:w16du="http://schemas.microsoft.com/office/word/2023/wordml/word16du" xmlns:w16sdtdh="http://schemas.microsoft.com/office/word/2020/wordml/sdtdatahash" xmlns:w16se="http://schemas.microsoft.com/office/word/2015/wordml/symex" xmlns:wpg="http://schemas.microsoft.com/office/word/2010/wordprocessingGroup" xmlns:wpi="http://schemas.microsoft.com/office/word/2010/wordprocessingInk" xmlns:wne="http://schemas.microsoft.com/office/word/2006/wordml" xmlns:wps="http://schemas.microsoft.com/office/word/2010/wordprocessingShape" mc:Ignorable="w14 w15 w16se w16cid w16 w16cex w16sdtdh w16du wp14">
+<w:hdr xmlns:wpc="http://schemas.microsoft.com/office/word/2010/wordprocessingCanvas" xmlns:cx="http://schemas.microsoft.com/office/drawing/2014/chartex" xmlns:cx1="http://schemas.microsoft.com/office/drawing/2015/9/8/chartex" xmlns:cx2="http://schemas.microsoft.com/office/drawing/2015/10/21/chartex" xmlns:cx3="http://schemas.microsoft.com/office/drawing/2016/5/9/chartex" xmlns:cx4="http://schemas.microsoft.com/office/drawing/2016/5/10/chartex" xmlns:cx5="http://schemas.microsoft.com/office/drawing/2016/5/11/chartex" xmlns:cx6="http://schemas.microsoft.com/office/drawing/2016/5/12/chartex" xmlns:cx7="http://schemas.microsoft.com/office/drawing/2016/5/13/chartex" xmlns:cx8="http://schemas.microsoft.com/office/drawing/2016/5/14/chartex" xmlns:mc="http://schemas.openxmlformats.org/markup-compatibility/2006" xmlns:aink="http://schemas.microsoft.com/office/drawing/2016/ink" xmlns:am3d="http://schemas.microsoft.com/office/drawing/2017/model3d" xmlns:o="urn:schemas-microsoft-com:office:office" xmlns:oel="http://schemas.microsoft.com/office/2019/extlst" xmlns:r="http://schemas.openxmlformats.org/officeDocument/2006/relationships" xmlns:m="http://schemas.openxmlformats.org/officeDocument/2006/math" xmlns:v="urn:schemas-microsoft-com:vml" xmlns:wp14="http://schemas.microsoft.com/office/word/2010/wordprocessingDrawing" xmlns:wp="http://schemas.openxmlformats.org/drawingml/2006/wordprocessingDrawing" xmlns:w10="urn:schemas-microsoft-com:office:word" xmlns:w="http://schemas.openxmlformats.org/wordprocessingml/2006/main" xmlns:w14="http://schemas.microsoft.com/office/word/2010/wordml" xmlns:w15="http://schemas.microsoft.com/office/word/2012/wordml" xmlns:w16cex="http://schemas.microsoft.com/office/word/2018/wordml/cex" xmlns:w16cid="http://schemas.microsoft.com/office/word/2016/wordml/cid" xmlns:w16="http://schemas.microsoft.com/office/word/2018/wordml" xmlns:w16du="http://schemas.microsoft.com/office/word/2023/wordml/word16du" xmlns:w16sdtdh="http://schemas.microsoft.com/office/word/2020/wordml/sdtdatahash" xmlns:w16sdtfl="http://schemas.microsoft.com/office/word/2024/wordml/sdtformatlock" xmlns:w16se="http://schemas.microsoft.com/office/word/2015/wordml/symex" xmlns:wpg="http://schemas.microsoft.com/office/word/2010/wordprocessingGroup" xmlns:wpi="http://schemas.microsoft.com/office/word/2010/wordprocessingInk" xmlns:wne="http://schemas.microsoft.com/office/word/2006/wordml" xmlns:wps="http://schemas.microsoft.com/office/word/2010/wordprocessingShape" mc:Ignorable="w14 w15 w16se w16cid w16 w16cex w16sdtdh w16sdtfl w16du wp14">
   <w:p>
     <w:pPr>
       <w:pStyle w:val="Encabezado"/>
@@ -3149,7 +3087,7 @@
 </file>
 
 <file path=word/header2.xml><?xml version="1.0" encoding="utf-8"?>
-<w:hdr xmlns:wpc="http://schemas.microsoft.com/office/word/2010/wordprocessingCanvas" xmlns:cx="http://schemas.microsoft.com/office/drawing/2014/chartex" xmlns:cx1="http://schemas.microsoft.com/office/drawing/2015/9/8/chartex" xmlns:cx2="http://schemas.microsoft.com/office/drawing/2015/10/21/chartex" xmlns:cx3="http://schemas.microsoft.com/office/drawing/2016/5/9/chartex" xmlns:cx4="http://schemas.microsoft.com/office/drawing/2016/5/10/chartex" xmlns:cx5="http://schemas.microsoft.com/office/drawing/2016/5/11/chartex" xmlns:cx6="http://schemas.microsoft.com/office/drawing/2016/5/12/chartex" xmlns:cx7="http://schemas.microsoft.com/office/drawing/2016/5/13/chartex" xmlns:cx8="http://schemas.microsoft.com/office/drawing/2016/5/14/chartex" xmlns:mc="http://schemas.openxmlformats.org/markup-compatibility/2006" xmlns:aink="http://schemas.microsoft.com/office/drawing/2016/ink" xmlns:am3d="http://schemas.microsoft.com/office/drawing/2017/model3d" xmlns:o="urn:schemas-microsoft-com:office:office" xmlns:oel="http://schemas.microsoft.com/office/2019/extlst" xmlns:r="http://schemas.openxmlformats.org/officeDocument/2006/relationships" xmlns:m="http://schemas.openxmlformats.org/officeDocument/2006/math" xmlns:v="urn:schemas-microsoft-com:vml" xmlns:wp14="http://schemas.microsoft.com/office/word/2010/wordprocessingDrawing" xmlns:wp="http://schemas.openxmlformats.org/drawingml/2006/wordprocessingDrawing" xmlns:w10="urn:schemas-microsoft-com:office:word" xmlns:w="http://schemas.openxmlformats.org/wordprocessingml/2006/main" xmlns:w14="http://schemas.microsoft.com/office/word/2010/wordml" xmlns:w15="http://schemas.microsoft.com/office/word/2012/wordml" xmlns:w16cex="http://schemas.microsoft.com/office/word/2018/wordml/cex" xmlns:w16cid="http://schemas.microsoft.com/office/word/2016/wordml/cid" xmlns:w16="http://schemas.microsoft.com/office/word/2018/wordml" xmlns:w16du="http://schemas.microsoft.com/office/word/2023/wordml/word16du" xmlns:w16sdtdh="http://schemas.microsoft.com/office/word/2020/wordml/sdtdatahash" xmlns:w16se="http://schemas.microsoft.com/office/word/2015/wordml/symex" xmlns:wpg="http://schemas.microsoft.com/office/word/2010/wordprocessingGroup" xmlns:wpi="http://schemas.microsoft.com/office/word/2010/wordprocessingInk" xmlns:wne="http://schemas.microsoft.com/office/word/2006/wordml" xmlns:wps="http://schemas.microsoft.com/office/word/2010/wordprocessingShape" mc:Ignorable="w14 w15 w16se w16cid w16 w16cex w16sdtdh w16du wp14">
+<w:hdr xmlns:wpc="http://schemas.microsoft.com/office/word/2010/wordprocessingCanvas" xmlns:cx="http://schemas.microsoft.com/office/drawing/2014/chartex" xmlns:cx1="http://schemas.microsoft.com/office/drawing/2015/9/8/chartex" xmlns:cx2="http://schemas.microsoft.com/office/drawing/2015/10/21/chartex" xmlns:cx3="http://schemas.microsoft.com/office/drawing/2016/5/9/chartex" xmlns:cx4="http://schemas.microsoft.com/office/drawing/2016/5/10/chartex" xmlns:cx5="http://schemas.microsoft.com/office/drawing/2016/5/11/chartex" xmlns:cx6="http://schemas.microsoft.com/office/drawing/2016/5/12/chartex" xmlns:cx7="http://schemas.microsoft.com/office/drawing/2016/5/13/chartex" xmlns:cx8="http://schemas.microsoft.com/office/drawing/2016/5/14/chartex" xmlns:mc="http://schemas.openxmlformats.org/markup-compatibility/2006" xmlns:aink="http://schemas.microsoft.com/office/drawing/2016/ink" xmlns:am3d="http://schemas.microsoft.com/office/drawing/2017/model3d" xmlns:o="urn:schemas-microsoft-com:office:office" xmlns:oel="http://schemas.microsoft.com/office/2019/extlst" xmlns:r="http://schemas.openxmlformats.org/officeDocument/2006/relationships" xmlns:m="http://schemas.openxmlformats.org/officeDocument/2006/math" xmlns:v="urn:schemas-microsoft-com:vml" xmlns:wp14="http://schemas.microsoft.com/office/word/2010/wordprocessingDrawing" xmlns:wp="http://schemas.openxmlformats.org/drawingml/2006/wordprocessingDrawing" xmlns:w10="urn:schemas-microsoft-com:office:word" xmlns:w="http://schemas.openxmlformats.org/wordprocessingml/2006/main" xmlns:w14="http://schemas.microsoft.com/office/word/2010/wordml" xmlns:w15="http://schemas.microsoft.com/office/word/2012/wordml" xmlns:w16cex="http://schemas.microsoft.com/office/word/2018/wordml/cex" xmlns:w16cid="http://schemas.microsoft.com/office/word/2016/wordml/cid" xmlns:w16="http://schemas.microsoft.com/office/word/2018/wordml" xmlns:w16du="http://schemas.microsoft.com/office/word/2023/wordml/word16du" xmlns:w16sdtdh="http://schemas.microsoft.com/office/word/2020/wordml/sdtdatahash" xmlns:w16sdtfl="http://schemas.microsoft.com/office/word/2024/wordml/sdtformatlock" xmlns:w16se="http://schemas.microsoft.com/office/word/2015/wordml/symex" xmlns:wpg="http://schemas.microsoft.com/office/word/2010/wordprocessingGroup" xmlns:wpi="http://schemas.microsoft.com/office/word/2010/wordprocessingInk" xmlns:wne="http://schemas.microsoft.com/office/word/2006/wordml" xmlns:wps="http://schemas.microsoft.com/office/word/2010/wordprocessingShape" mc:Ignorable="w14 w15 w16se w16cid w16 w16cex w16sdtdh w16sdtfl w16du wp14">
   <w:p>
     <w:pPr>
       <w:pStyle w:val="Encabezado"/>
@@ -3515,7 +3453,7 @@
 </file>
 
 <file path=word/header3.xml><?xml version="1.0" encoding="utf-8"?>
-<w:hdr xmlns:wpc="http://schemas.microsoft.com/office/word/2010/wordprocessingCanvas" xmlns:cx="http://schemas.microsoft.com/office/drawing/2014/chartex" xmlns:cx1="http://schemas.microsoft.com/office/drawing/2015/9/8/chartex" xmlns:cx2="http://schemas.microsoft.com/office/drawing/2015/10/21/chartex" xmlns:cx3="http://schemas.microsoft.com/office/drawing/2016/5/9/chartex" xmlns:cx4="http://schemas.microsoft.com/office/drawing/2016/5/10/chartex" xmlns:cx5="http://schemas.microsoft.com/office/drawing/2016/5/11/chartex" xmlns:cx6="http://schemas.microsoft.com/office/drawing/2016/5/12/chartex" xmlns:cx7="http://schemas.microsoft.com/office/drawing/2016/5/13/chartex" xmlns:cx8="http://schemas.microsoft.com/office/drawing/2016/5/14/chartex" xmlns:mc="http://schemas.openxmlformats.org/markup-compatibility/2006" xmlns:aink="http://schemas.microsoft.com/office/drawing/2016/ink" xmlns:am3d="http://schemas.microsoft.com/office/drawing/2017/model3d" xmlns:o="urn:schemas-microsoft-com:office:office" xmlns:oel="http://schemas.microsoft.com/office/2019/extlst" xmlns:r="http://schemas.openxmlformats.org/officeDocument/2006/relationships" xmlns:m="http://schemas.openxmlformats.org/officeDocument/2006/math" xmlns:v="urn:schemas-microsoft-com:vml" xmlns:wp14="http://schemas.microsoft.com/office/word/2010/wordprocessingDrawing" xmlns:wp="http://schemas.openxmlformats.org/drawingml/2006/wordprocessingDrawing" xmlns:w10="urn:schemas-microsoft-com:office:word" xmlns:w="http://schemas.openxmlformats.org/wordprocessingml/2006/main" xmlns:w14="http://schemas.microsoft.com/office/word/2010/wordml" xmlns:w15="http://schemas.microsoft.com/office/word/2012/wordml" xmlns:w16cex="http://schemas.microsoft.com/office/word/2018/wordml/cex" xmlns:w16cid="http://schemas.microsoft.com/office/word/2016/wordml/cid" xmlns:w16="http://schemas.microsoft.com/office/word/2018/wordml" xmlns:w16du="http://schemas.microsoft.com/office/word/2023/wordml/word16du" xmlns:w16sdtdh="http://schemas.microsoft.com/office/word/2020/wordml/sdtdatahash" xmlns:w16se="http://schemas.microsoft.com/office/word/2015/wordml/symex" xmlns:wpg="http://schemas.microsoft.com/office/word/2010/wordprocessingGroup" xmlns:wpi="http://schemas.microsoft.com/office/word/2010/wordprocessingInk" xmlns:wne="http://schemas.microsoft.com/office/word/2006/wordml" xmlns:wps="http://schemas.microsoft.com/office/word/2010/wordprocessingShape" mc:Ignorable="w14 w15 w16se w16cid w16 w16cex w16sdtdh w16du wp14">
+<w:hdr xmlns:wpc="http://schemas.microsoft.com/office/word/2010/wordprocessingCanvas" xmlns:cx="http://schemas.microsoft.com/office/drawing/2014/chartex" xmlns:cx1="http://schemas.microsoft.com/office/drawing/2015/9/8/chartex" xmlns:cx2="http://schemas.microsoft.com/office/drawing/2015/10/21/chartex" xmlns:cx3="http://schemas.microsoft.com/office/drawing/2016/5/9/chartex" xmlns:cx4="http://schemas.microsoft.com/office/drawing/2016/5/10/chartex" xmlns:cx5="http://schemas.microsoft.com/office/drawing/2016/5/11/chartex" xmlns:cx6="http://schemas.microsoft.com/office/drawing/2016/5/12/chartex" xmlns:cx7="http://schemas.microsoft.com/office/drawing/2016/5/13/chartex" xmlns:cx8="http://schemas.microsoft.com/office/drawing/2016/5/14/chartex" xmlns:mc="http://schemas.openxmlformats.org/markup-compatibility/2006" xmlns:aink="http://schemas.microsoft.com/office/drawing/2016/ink" xmlns:am3d="http://schemas.microsoft.com/office/drawing/2017/model3d" xmlns:o="urn:schemas-microsoft-com:office:office" xmlns:oel="http://schemas.microsoft.com/office/2019/extlst" xmlns:r="http://schemas.openxmlformats.org/officeDocument/2006/relationships" xmlns:m="http://schemas.openxmlformats.org/officeDocument/2006/math" xmlns:v="urn:schemas-microsoft-com:vml" xmlns:wp14="http://schemas.microsoft.com/office/word/2010/wordprocessingDrawing" xmlns:wp="http://schemas.openxmlformats.org/drawingml/2006/wordprocessingDrawing" xmlns:w10="urn:schemas-microsoft-com:office:word" xmlns:w="http://schemas.openxmlformats.org/wordprocessingml/2006/main" xmlns:w14="http://schemas.microsoft.com/office/word/2010/wordml" xmlns:w15="http://schemas.microsoft.com/office/word/2012/wordml" xmlns:w16cex="http://schemas.microsoft.com/office/word/2018/wordml/cex" xmlns:w16cid="http://schemas.microsoft.com/office/word/2016/wordml/cid" xmlns:w16="http://schemas.microsoft.com/office/word/2018/wordml" xmlns:w16du="http://schemas.microsoft.com/office/word/2023/wordml/word16du" xmlns:w16sdtdh="http://schemas.microsoft.com/office/word/2020/wordml/sdtdatahash" xmlns:w16sdtfl="http://schemas.microsoft.com/office/word/2024/wordml/sdtformatlock" xmlns:w16se="http://schemas.microsoft.com/office/word/2015/wordml/symex" xmlns:wpg="http://schemas.microsoft.com/office/word/2010/wordprocessingGroup" xmlns:wpi="http://schemas.microsoft.com/office/word/2010/wordprocessingInk" xmlns:wne="http://schemas.microsoft.com/office/word/2006/wordml" xmlns:wps="http://schemas.microsoft.com/office/word/2010/wordprocessingShape" mc:Ignorable="w14 w15 w16se w16cid w16 w16cex w16sdtdh w16sdtfl w16du wp14">
   <w:p>
     <w:pPr>
       <w:pStyle w:val="Encabezado"/>
@@ -3525,7 +3463,7 @@
 </file>
 
 <file path=word/numbering.xml><?xml version="1.0" encoding="utf-8"?>
-<w:numbering xmlns:wpc="http://schemas.microsoft.com/office/word/2010/wordprocessingCanvas" xmlns:cx="http://schemas.microsoft.com/office/drawing/2014/chartex" xmlns:cx1="http://schemas.microsoft.com/office/drawing/2015/9/8/chartex" xmlns:cx2="http://schemas.microsoft.com/office/drawing/2015/10/21/chartex" xmlns:cx3="http://schemas.microsoft.com/office/drawing/2016/5/9/chartex" xmlns:cx4="http://schemas.microsoft.com/office/drawing/2016/5/10/chartex" xmlns:cx5="http://schemas.microsoft.com/office/drawing/2016/5/11/chartex" xmlns:cx6="http://schemas.microsoft.com/office/drawing/2016/5/12/chartex" xmlns:cx7="http://schemas.microsoft.com/office/drawing/2016/5/13/chartex" xmlns:cx8="http://schemas.microsoft.com/office/drawing/2016/5/14/chartex" xmlns:mc="http://schemas.openxmlformats.org/markup-compatibility/2006" xmlns:aink="http://schemas.microsoft.com/office/drawing/2016/ink" xmlns:am3d="http://schemas.microsoft.com/office/drawing/2017/model3d" xmlns:o="urn:schemas-microsoft-com:office:office" xmlns:oel="http://schemas.microsoft.com/office/2019/extlst" xmlns:r="http://schemas.openxmlformats.org/officeDocument/2006/relationships" xmlns:m="http://schemas.openxmlformats.org/officeDocument/2006/math" xmlns:v="urn:schemas-microsoft-com:vml" xmlns:wp14="http://schemas.microsoft.com/office/word/2010/wordprocessingDrawing" xmlns:wp="http://schemas.openxmlformats.org/drawingml/2006/wordprocessingDrawing" xmlns:w10="urn:schemas-microsoft-com:office:word" xmlns:w="http://schemas.openxmlformats.org/wordprocessingml/2006/main" xmlns:w14="http://schemas.microsoft.com/office/word/2010/wordml" xmlns:w15="http://schemas.microsoft.com/office/word/2012/wordml" xmlns:w16cex="http://schemas.microsoft.com/office/word/2018/wordml/cex" xmlns:w16cid="http://schemas.microsoft.com/office/word/2016/wordml/cid" xmlns:w16="http://schemas.microsoft.com/office/word/2018/wordml" xmlns:w16du="http://schemas.microsoft.com/office/word/2023/wordml/word16du" xmlns:w16sdtdh="http://schemas.microsoft.com/office/word/2020/wordml/sdtdatahash" xmlns:w16se="http://schemas.microsoft.com/office/word/2015/wordml/symex" xmlns:wpg="http://schemas.microsoft.com/office/word/2010/wordprocessingGroup" xmlns:wpi="http://schemas.microsoft.com/office/word/2010/wordprocessingInk" xmlns:wne="http://schemas.microsoft.com/office/word/2006/wordml" xmlns:wps="http://schemas.microsoft.com/office/word/2010/wordprocessingShape" mc:Ignorable="w14 w15 w16se w16cid w16 w16cex w16sdtdh w16du wp14">
+<w:numbering xmlns:wpc="http://schemas.microsoft.com/office/word/2010/wordprocessingCanvas" xmlns:cx="http://schemas.microsoft.com/office/drawing/2014/chartex" xmlns:cx1="http://schemas.microsoft.com/office/drawing/2015/9/8/chartex" xmlns:cx2="http://schemas.microsoft.com/office/drawing/2015/10/21/chartex" xmlns:cx3="http://schemas.microsoft.com/office/drawing/2016/5/9/chartex" xmlns:cx4="http://schemas.microsoft.com/office/drawing/2016/5/10/chartex" xmlns:cx5="http://schemas.microsoft.com/office/drawing/2016/5/11/chartex" xmlns:cx6="http://schemas.microsoft.com/office/drawing/2016/5/12/chartex" xmlns:cx7="http://schemas.microsoft.com/office/drawing/2016/5/13/chartex" xmlns:cx8="http://schemas.microsoft.com/office/drawing/2016/5/14/chartex" xmlns:mc="http://schemas.openxmlformats.org/markup-compatibility/2006" xmlns:aink="http://schemas.microsoft.com/office/drawing/2016/ink" xmlns:am3d="http://schemas.microsoft.com/office/drawing/2017/model3d" xmlns:o="urn:schemas-microsoft-com:office:office" xmlns:oel="http://schemas.microsoft.com/office/2019/extlst" xmlns:r="http://schemas.openxmlformats.org/officeDocument/2006/relationships" xmlns:m="http://schemas.openxmlformats.org/officeDocument/2006/math" xmlns:v="urn:schemas-microsoft-com:vml" xmlns:wp14="http://schemas.microsoft.com/office/word/2010/wordprocessingDrawing" xmlns:wp="http://schemas.openxmlformats.org/drawingml/2006/wordprocessingDrawing" xmlns:w10="urn:schemas-microsoft-com:office:word" xmlns:w="http://schemas.openxmlformats.org/wordprocessingml/2006/main" xmlns:w14="http://schemas.microsoft.com/office/word/2010/wordml" xmlns:w15="http://schemas.microsoft.com/office/word/2012/wordml" xmlns:w16cex="http://schemas.microsoft.com/office/word/2018/wordml/cex" xmlns:w16cid="http://schemas.microsoft.com/office/word/2016/wordml/cid" xmlns:w16="http://schemas.microsoft.com/office/word/2018/wordml" xmlns:w16du="http://schemas.microsoft.com/office/word/2023/wordml/word16du" xmlns:w16sdtdh="http://schemas.microsoft.com/office/word/2020/wordml/sdtdatahash" xmlns:w16sdtfl="http://schemas.microsoft.com/office/word/2024/wordml/sdtformatlock" xmlns:w16se="http://schemas.microsoft.com/office/word/2015/wordml/symex" xmlns:wpg="http://schemas.microsoft.com/office/word/2010/wordprocessingGroup" xmlns:wpi="http://schemas.microsoft.com/office/word/2010/wordprocessingInk" xmlns:wne="http://schemas.microsoft.com/office/word/2006/wordml" xmlns:wps="http://schemas.microsoft.com/office/word/2010/wordprocessingShape" mc:Ignorable="w14 w15 w16se w16cid w16 w16cex w16sdtdh w16sdtfl w16du wp14">
   <w:abstractNum w:abstractNumId="0" w15:restartNumberingAfterBreak="0">
     <w:nsid w:val="0E94048F"/>
     <w:multiLevelType w:val="multilevel"/>
@@ -4508,7 +4446,7 @@
 </file>
 
 <file path=word/styles.xml><?xml version="1.0" encoding="utf-8"?>
-<w:styles xmlns:mc="http://schemas.openxmlformats.org/markup-compatibility/2006" xmlns:r="http://schemas.openxmlformats.org/officeDocument/2006/relationships" xmlns:w="http://schemas.openxmlformats.org/wordprocessingml/2006/main" xmlns:w14="http://schemas.microsoft.com/office/word/2010/wordml" xmlns:w15="http://schemas.microsoft.com/office/word/2012/wordml" xmlns:w16cex="http://schemas.microsoft.com/office/word/2018/wordml/cex" xmlns:w16cid="http://schemas.microsoft.com/office/word/2016/wordml/cid" xmlns:w16="http://schemas.microsoft.com/office/word/2018/wordml" xmlns:w16du="http://schemas.microsoft.com/office/word/2023/wordml/word16du" xmlns:w16sdtdh="http://schemas.microsoft.com/office/word/2020/wordml/sdtdatahash" xmlns:w16se="http://schemas.microsoft.com/office/word/2015/wordml/symex" mc:Ignorable="w14 w15 w16se w16cid w16 w16cex w16sdtdh w16du">
+<w:styles xmlns:mc="http://schemas.openxmlformats.org/markup-compatibility/2006" xmlns:r="http://schemas.openxmlformats.org/officeDocument/2006/relationships" xmlns:w="http://schemas.openxmlformats.org/wordprocessingml/2006/main" xmlns:w14="http://schemas.microsoft.com/office/word/2010/wordml" xmlns:w15="http://schemas.microsoft.com/office/word/2012/wordml" xmlns:w16cex="http://schemas.microsoft.com/office/word/2018/wordml/cex" xmlns:w16cid="http://schemas.microsoft.com/office/word/2016/wordml/cid" xmlns:w16="http://schemas.microsoft.com/office/word/2018/wordml" xmlns:w16du="http://schemas.microsoft.com/office/word/2023/wordml/word16du" xmlns:w16sdtdh="http://schemas.microsoft.com/office/word/2020/wordml/sdtdatahash" xmlns:w16sdtfl="http://schemas.microsoft.com/office/word/2024/wordml/sdtformatlock" xmlns:w16se="http://schemas.microsoft.com/office/word/2015/wordml/symex" mc:Ignorable="w14 w15 w16se w16cid w16 w16cex w16sdtdh w16sdtfl w16du">
   <w:docDefaults>
     <w:rPrDefault>
       <w:rPr>

</xml_diff>